<commit_message>
docs: finalize GEP trial application and annex
</commit_message>
<xml_diff>
--- a/docs/projects/haidian_gep_xuannv_application_formal_20260729_zh.docx
+++ b/docs/projects/haidian_gep_xuannv_application_formal_20260729_zh.docx
@@ -97,6 +97,34 @@
           <w:sz w:val="24"/>
         </w:rPr>
         <w:t>成果转化方式：业务化、工程化</w:t>
+      </w:r>
+    </w:p>
+    <w:p>
+      <w:pPr>
+        <w:spacing w:after="100" w:line="360" w:lineRule="auto"/>
+        <w:ind w:firstLine="420"/>
+      </w:pPr>
+      <w:r>
+        <w:rPr>
+          <w:rFonts w:ascii="Times New Roman" w:hAnsi="Times New Roman" w:eastAsia="宋体"/>
+          <w:b w:val="0"/>
+          <w:sz w:val="24"/>
+        </w:rPr>
+        <w:t>对应规划方向：生态环境治理与数字化</w:t>
+      </w:r>
+    </w:p>
+    <w:p>
+      <w:pPr>
+        <w:spacing w:after="100" w:line="360" w:lineRule="auto"/>
+        <w:ind w:firstLine="420"/>
+      </w:pPr>
+      <w:r>
+        <w:rPr>
+          <w:rFonts w:ascii="Times New Roman" w:hAnsi="Times New Roman" w:eastAsia="宋体"/>
+          <w:b w:val="0"/>
+          <w:sz w:val="24"/>
+        </w:rPr>
+        <w:t>对应指南方向：生态系统服务核算与遥感智能分析</w:t>
       </w:r>
     </w:p>
     <w:p>
@@ -826,6 +854,33 @@
     </w:p>
     <w:p>
       <w:pPr>
+        <w:spacing w:before="180" w:after="80"/>
+      </w:pPr>
+      <w:r>
+        <w:rPr>
+          <w:rFonts w:ascii="Times New Roman" w:hAnsi="Times New Roman" w:eastAsia="宋体"/>
+          <w:b/>
+          <w:sz w:val="24"/>
+        </w:rPr>
+        <w:t>4. 效益预期</w:t>
+      </w:r>
+    </w:p>
+    <w:p>
+      <w:pPr>
+        <w:spacing w:after="100" w:line="360" w:lineRule="auto"/>
+        <w:ind w:firstLine="420"/>
+      </w:pPr>
+      <w:r>
+        <w:rPr>
+          <w:rFonts w:ascii="Times New Roman" w:hAnsi="Times New Roman" w:eastAsia="宋体"/>
+          <w:b w:val="0"/>
+          <w:sz w:val="24"/>
+        </w:rPr>
+        <w:t>项目将形成统一的数据台账、过程核算和结果复核流程，支撑核算年度的专题更新、服务结果汇总和审查复算，减少多源资料重复整理与人工核对工作。通过数据、模型、参数和结果的关联记录，提高试点成果的可追溯性，为海淀区生态空间精细化管理和后续完整GEP核算提供可复用的技术基础。</w:t>
+      </w:r>
+    </w:p>
+    <w:p>
+      <w:pPr>
         <w:spacing w:before="300" w:after="160"/>
       </w:pPr>
       <w:r>
@@ -861,7 +916,7 @@
           <w:b w:val="0"/>
           <w:sz w:val="24"/>
         </w:rPr>
-        <w:t>遥感基础模型正由单一影像分类向多源、多时相地表表征发展，可为生态系统类型识别、地表状态更新和专题模型输入准备提供统一数据基础。生态系统服务核算仍以生态过程模型、监测和统计资料为核心，遥感产品主要用于生态系统面积、植被状态、水体和土地覆盖等空间化。本项目采用“遥感表征支撑空间状态、专题模型完成过程核算、标准方法完成价值量核算”的路径，避免以单一模型替代生态过程和价值参数。</w:t>
+        <w:t>国际上，遥感基础模型与生态系统服务模型的结合正在发展，重点在于多源地表状态表征和生态过程模型输入准备；国内已形成以国家标准为基础、结合遥感监测、统计和过程模型开展生态产品核算的技术路径。生态系统服务核算仍以生态过程模型、监测和统计资料为核心，遥感产品主要用于生态系统面积、植被状态、水体和土地覆盖等空间化。本项目采用“遥感表征支撑空间状态、专题模型完成过程核算、标准方法完成价值量核算”的路径，服务海淀区城市尺度试点。</w:t>
       </w:r>
     </w:p>
     <w:p>
@@ -888,7 +943,7 @@
           <w:b w:val="0"/>
           <w:sz w:val="24"/>
         </w:rPr>
-        <w:t>项目已形成玄女海淀月度地理嵌入基础。现有生产模型在2025年12月至2026年5月、320个数据范围内完成多源遥感表征试验，输入包括Sentinel-1、Sentinel-2、Landsat、高分光学和高分SAR等数据，输出为128×128×64的名义10米等效分析网格。现有建筑、道路和水体结果使用与预训练开放地图弱语义同源的标签，属于内部制图验证，不作为生态服务或GEP核算精度依据。</w:t>
+        <w:t>项目已形成玄女海淀月度地理嵌入基础。现有生产模型在2025年12月至2026年5月、320个1,280米×1,280米样本单元内完成多源遥感表征试验，输入包括Sentinel-1、Sentinel-2、Landsat、高分光学和高分SAR等数据，输出为128×128×64的名义10米等效分析网格。现有建筑、道路和水体结果使用与预训练开放地图弱语义同源的标签，属于内部制图验证，不作为生态服务或GEP核算精度依据。</w:t>
       </w:r>
     </w:p>
     <w:p>
@@ -903,6 +958,20 @@
           <w:sz w:val="24"/>
         </w:rPr>
         <w:t>项目具备遥感数据处理、月度嵌入生成、专题制图、数据版本管理和下游模型评测基础。生态系统类型、气象、水文、监测、统计和价值参数资料将在项目启动阶段与相关数据责任方对接，形成数据取得清单和时间安排。</w:t>
+      </w:r>
+    </w:p>
+    <w:p>
+      <w:pPr>
+        <w:spacing w:after="100" w:line="360" w:lineRule="auto"/>
+        <w:ind w:firstLine="420"/>
+      </w:pPr>
+      <w:r>
+        <w:rPr>
+          <w:rFonts w:ascii="Times New Roman" w:hAnsi="Times New Roman" w:eastAsia="宋体"/>
+          <w:b w:val="0"/>
+          <w:sz w:val="24"/>
+        </w:rPr>
+        <w:t>申报单位具备城市规划、生态评估、遥感地理信息与工程咨询相关的业务基础，可组织遥感数据处理、生态核算、专题模型、软件开发和成果复核等专业力量参与项目实施。项目相关单位的既有项目经历、平台条件、参与人员及分工由申报单位在正式申报表中据实补充。</w:t>
       </w:r>
     </w:p>
     <w:p>
@@ -1039,6 +1108,20 @@
           <w:sz w:val="24"/>
         </w:rPr>
         <w:t>项目启动后建立“服务—实物量定义—主模型—过程单元—校准资料—独立验证资料—参数来源—数据责任方”的矩阵。每月产品登记有效像元率、数据源可用性、时相差、质量等级和降级原因；质量不满足核算要求的区域不进入价值量计算。各服务使用同口径传统基线和统一验证集开展对比，报告嵌入产品带来的差异、置信区间和消融结果，不预设必须优于基线的结论。</w:t>
+      </w:r>
+    </w:p>
+    <w:p>
+      <w:pPr>
+        <w:spacing w:after="100" w:line="360" w:lineRule="auto"/>
+        <w:ind w:firstLine="420"/>
+      </w:pPr>
+      <w:r>
+        <w:rPr>
+          <w:rFonts w:ascii="Times New Roman" w:hAnsi="Times New Roman" w:eastAsia="宋体"/>
+          <w:b w:val="0"/>
+          <w:sz w:val="24"/>
+        </w:rPr>
+        <w:t>核心服务的数据门槛、验收与书面变更规则以技术实施附件为准。未签署书面变更时，三类服务均为正式验收范围；发生书面变更时，服务范围、成果、指标和经费同步调整。</w:t>
       </w:r>
     </w:p>
     <w:p>

</xml_diff>

<commit_message>
docs: render Haidian GEP trial in application template
</commit_message>
<xml_diff>
--- a/docs/projects/haidian_gep_xuannv_application_formal_20260729_zh.docx
+++ b/docs/projects/haidian_gep_xuannv_application_formal_20260729_zh.docx
@@ -315,7 +315,7 @@
           <w:b w:val="0"/>
           <w:sz w:val="24"/>
         </w:rPr>
-        <w:t>1. 数据对齐与样本库构建。形成遥感影像、生态系统类型、地形、气象、土壤、水文、监测、统计和价值参数四类数据台账；明确原始观测、重采样辅助变量和模型推断结果的属性，建立质量控制与版本记录机制。</w:t>
+        <w:t>1. 数据对齐与样本库构建。形成观测数据、生态状态数据、服务实物量数据和价值参数数据四类台账；其中包括遥感影像、生态系统类型、地形、气象、土壤、水文、监测、统计和价格参数。明确原始观测、重采样辅助变量和模型推断结果的属性，建立质量控制与版本记录机制。</w:t>
       </w:r>
     </w:p>
     <w:p>
@@ -343,7 +343,7 @@
           <w:b w:val="0"/>
           <w:sz w:val="24"/>
         </w:rPr>
-        <w:t>3. 三类调节服务核算。固定二氧化碳服务按照GB/T 46869—2025附录A.7，根据资料条件采用生物量法、固碳速率法或NEP法；洪水调蓄服务按照附录A.6完成标准核算，同时将城市生态覆盖增量雨洪效益作为补充分析并与标准核算结果分表；局部气候调节按照附录A.11完成蒸散发能量或实测温差核算。三项服务均采用独立资料开展验证。</w:t>
+        <w:t>3. 三类调节服务核算。固定二氧化碳服务按照GB/T 46869—2025附录A.7，根据资料条件采用生物量法、固碳速率法或净生态系统生产力（NEP）法；洪水调蓄服务按照附录A.6完成标准核算，同时将城市生态覆盖增量雨洪效益作为补充分析并与标准核算结果分表；局部气候调节按照附录A.11完成蒸散发能量或实测温差核算。三项服务均采用独立资料开展验证。</w:t>
       </w:r>
     </w:p>
     <w:p>
@@ -813,6 +813,20 @@
     </w:p>
     <w:p>
       <w:pPr>
+        <w:spacing w:after="100" w:line="360" w:lineRule="auto"/>
+        <w:ind w:firstLine="420"/>
+      </w:pPr>
+      <w:r>
+        <w:rPr>
+          <w:rFonts w:ascii="Times New Roman" w:hAnsi="Times New Roman" w:eastAsia="宋体"/>
+          <w:b w:val="0"/>
+          <w:sz w:val="24"/>
+        </w:rPr>
+        <w:t>6. 完成一个核算年度12期月度生态状态基础产品、三类服务专题成果和一套试点报告；全部产品均具备数据来源、时间、空间参考、处理版本和质量标识。每项服务形成独立验证记录和计算复现记录，具体服务精度与样本判定要求按照随申报书提交的技术实施与验收说明执行。</w:t>
+      </w:r>
+    </w:p>
+    <w:p>
+      <w:pPr>
         <w:spacing w:before="180" w:after="80"/>
       </w:pPr>
       <w:r>
@@ -1107,7 +1121,7 @@
           <w:b w:val="0"/>
           <w:sz w:val="24"/>
         </w:rPr>
-        <w:t>项目启动后建立“服务—实物量定义—主模型—过程单元—校准资料—独立验证资料—参数来源—数据责任方”的矩阵。每月产品登记有效像元率、数据源可用性、时相差、质量等级和降级原因；质量不满足核算要求的区域不进入价值量计算。各服务使用同口径传统基线和统一验证集开展对比，报告嵌入产品带来的差异、置信区间和消融结果，不预设必须优于基线的结论。</w:t>
+        <w:t>项目启动后建立服务实物量、过程单元、校准资料、独立验证资料、参数来源和数据责任方的对应关系。每月产品登记有效像元率、数据源可用性、时相差、质量等级和降级原因；质量不满足核算要求的区域不进入价值量计算。各服务使用同口径传统基线和统一验证集开展对比，报告嵌入产品带来的差异、置信区间和消融结果，不预设必须优于基线的结论。</w:t>
       </w:r>
     </w:p>
     <w:p>
@@ -1121,7 +1135,7 @@
           <w:b w:val="0"/>
           <w:sz w:val="24"/>
         </w:rPr>
-        <w:t>核心服务的数据门槛、验收与书面变更规则以技术实施附件为准。未签署书面变更时，三类服务均为正式验收范围；发生书面变更时，服务范围、成果、指标和经费同步调整。</w:t>
+        <w:t>核心服务的数据门槛、验收与书面变更规则详见随申报书提交的《基于玄女月度地理嵌入的海淀区生态系统调节服务价值核算技术试点实施与验收说明》。未签署书面变更时，三类服务均为正式验收范围；发生书面变更时，服务范围、成果、指标和经费同步调整。</w:t>
       </w:r>
     </w:p>
     <w:p>

</xml_diff>